<commit_message>
fixed the geom dodge
</commit_message>
<xml_diff>
--- a/docs/common_code/03_ggplot/ggplot.docx
+++ b/docs/common_code/03_ggplot/ggplot.docx
@@ -31,7 +31,7 @@
         <w:pStyle w:val="Date"/>
       </w:pPr>
       <w:r>
-        <w:t xml:space="preserve">2026-09-08</w:t>
+        <w:t xml:space="preserve">2026-09-10</w:t>
       </w:r>
     </w:p>
     <w:bookmarkStart w:id="11" w:name="introduction-to-ggplot2"/>
@@ -2060,194 +2060,7 @@
         <w:pStyle w:val="FirstParagraph"/>
       </w:pPr>
       <w:r>
-        <w:t xml:space="preserve">A boxplot alone hides sample size. Adding jittered points shows both the distribution shape and how many observations went into each box:</w:t>
-      </w:r>
-    </w:p>
-    <w:p>
-      <w:pPr>
-        <w:pStyle w:val="SourceCode"/>
-      </w:pPr>
-      <w:r>
-        <w:rPr>
-          <w:rStyle w:val="FunctionTok"/>
-        </w:rPr>
-        <w:t xml:space="preserve">ggplot</w:t>
-      </w:r>
-      <w:r>
-        <w:rPr>
-          <w:rStyle w:val="NormalTok"/>
-        </w:rPr>
-        <w:t xml:space="preserve">(penguins, </w:t>
-      </w:r>
-      <w:r>
-        <w:rPr>
-          <w:rStyle w:val="FunctionTok"/>
-        </w:rPr>
-        <w:t xml:space="preserve">aes</w:t>
-      </w:r>
-      <w:r>
-        <w:rPr>
-          <w:rStyle w:val="NormalTok"/>
-        </w:rPr>
-        <w:t xml:space="preserve">(</w:t>
-      </w:r>
-      <w:r>
-        <w:rPr>
-          <w:rStyle w:val="AttributeTok"/>
-        </w:rPr>
-        <w:t xml:space="preserve">x =</w:t>
-      </w:r>
-      <w:r>
-        <w:rPr>
-          <w:rStyle w:val="NormalTok"/>
-        </w:rPr>
-        <w:t xml:space="preserve"> species, </w:t>
-      </w:r>
-      <w:r>
-        <w:rPr>
-          <w:rStyle w:val="AttributeTok"/>
-        </w:rPr>
-        <w:t xml:space="preserve">y =</w:t>
-      </w:r>
-      <w:r>
-        <w:rPr>
-          <w:rStyle w:val="NormalTok"/>
-        </w:rPr>
-        <w:t xml:space="preserve"> body_mass_g)) </w:t>
-      </w:r>
-      <w:r>
-        <w:rPr>
-          <w:rStyle w:val="SpecialCharTok"/>
-        </w:rPr>
-        <w:t xml:space="preserve">+</w:t>
-      </w:r>
-      <w:r>
-        <w:br/>
-      </w:r>
-      <w:r>
-        <w:rPr>
-          <w:rStyle w:val="NormalTok"/>
-        </w:rPr>
-        <w:t xml:space="preserve">  </w:t>
-      </w:r>
-      <w:r>
-        <w:rPr>
-          <w:rStyle w:val="FunctionTok"/>
-        </w:rPr>
-        <w:t xml:space="preserve">geom_boxplot</w:t>
-      </w:r>
-      <w:r>
-        <w:rPr>
-          <w:rStyle w:val="NormalTok"/>
-        </w:rPr>
-        <w:t xml:space="preserve">() </w:t>
-      </w:r>
-      <w:r>
-        <w:rPr>
-          <w:rStyle w:val="SpecialCharTok"/>
-        </w:rPr>
-        <w:t xml:space="preserve">+</w:t>
-      </w:r>
-      <w:r>
-        <w:br/>
-      </w:r>
-      <w:r>
-        <w:rPr>
-          <w:rStyle w:val="NormalTok"/>
-        </w:rPr>
-        <w:t xml:space="preserve">  </w:t>
-      </w:r>
-      <w:r>
-        <w:rPr>
-          <w:rStyle w:val="FunctionTok"/>
-        </w:rPr>
-        <w:t xml:space="preserve">geom_jitter</w:t>
-      </w:r>
-      <w:r>
-        <w:rPr>
-          <w:rStyle w:val="NormalTok"/>
-        </w:rPr>
-        <w:t xml:space="preserve">(</w:t>
-      </w:r>
-      <w:r>
-        <w:rPr>
-          <w:rStyle w:val="AttributeTok"/>
-        </w:rPr>
-        <w:t xml:space="preserve">width =</w:t>
-      </w:r>
-      <w:r>
-        <w:rPr>
-          <w:rStyle w:val="NormalTok"/>
-        </w:rPr>
-        <w:t xml:space="preserve"> </w:t>
-      </w:r>
-      <w:r>
-        <w:rPr>
-          <w:rStyle w:val="FloatTok"/>
-        </w:rPr>
-        <w:t xml:space="preserve">0.15</w:t>
-      </w:r>
-      <w:r>
-        <w:rPr>
-          <w:rStyle w:val="NormalTok"/>
-        </w:rPr>
-        <w:t xml:space="preserve">, </w:t>
-      </w:r>
-      <w:r>
-        <w:rPr>
-          <w:rStyle w:val="AttributeTok"/>
-        </w:rPr>
-        <w:t xml:space="preserve">alpha =</w:t>
-      </w:r>
-      <w:r>
-        <w:rPr>
-          <w:rStyle w:val="NormalTok"/>
-        </w:rPr>
-        <w:t xml:space="preserve"> </w:t>
-      </w:r>
-      <w:r>
-        <w:rPr>
-          <w:rStyle w:val="FloatTok"/>
-        </w:rPr>
-        <w:t xml:space="preserve">0.4</w:t>
-      </w:r>
-      <w:r>
-        <w:rPr>
-          <w:rStyle w:val="NormalTok"/>
-        </w:rPr>
-        <w:t xml:space="preserve">, </w:t>
-      </w:r>
-      <w:r>
-        <w:rPr>
-          <w:rStyle w:val="AttributeTok"/>
-        </w:rPr>
-        <w:t xml:space="preserve">color =</w:t>
-      </w:r>
-      <w:r>
-        <w:rPr>
-          <w:rStyle w:val="NormalTok"/>
-        </w:rPr>
-        <w:t xml:space="preserve"> </w:t>
-      </w:r>
-      <w:r>
-        <w:rPr>
-          <w:rStyle w:val="StringTok"/>
-        </w:rPr>
-        <w:t xml:space="preserve">"darkblue"</w:t>
-      </w:r>
-      <w:r>
-        <w:rPr>
-          <w:rStyle w:val="NormalTok"/>
-        </w:rPr>
-        <w:t xml:space="preserve">)</w:t>
-      </w:r>
-    </w:p>
-    <w:p>
-      <w:pPr>
-        <w:pStyle w:val="BlockText"/>
-      </w:pPr>
-      <w:r>
-        <w:t xml:space="preserve">💡</w:t>
+        <w:t xml:space="preserve">A boxplot alone hides sample size. Adding jittered points shows both the distribution shape and how many observations went into each box. Define the point position</w:t>
       </w:r>
       <w:r>
         <w:t xml:space="preserve"> </w:t>
@@ -2257,43 +2070,272 @@
           <w:b/>
           <w:bCs/>
         </w:rPr>
-        <w:t xml:space="preserve">Key idea:</w:t>
-      </w:r>
-      <w:r>
-        <w:t xml:space="preserve"> </w:t>
-      </w:r>
-      <w:r>
-        <w:t xml:space="preserve">Layer order matters.</w:t>
-      </w:r>
-      <w:r>
-        <w:t xml:space="preserve"> </w:t>
-      </w:r>
-      <w:r>
-        <w:rPr>
-          <w:rStyle w:val="VerbatimChar"/>
-        </w:rPr>
-        <w:t xml:space="preserve">geom_boxplot()</w:t>
-      </w:r>
-      <w:r>
-        <w:t xml:space="preserve"> </w:t>
-      </w:r>
-      <w:r>
-        <w:t xml:space="preserve">first and</w:t>
-      </w:r>
-      <w:r>
-        <w:t xml:space="preserve"> </w:t>
-      </w:r>
-      <w:r>
-        <w:rPr>
-          <w:rStyle w:val="VerbatimChar"/>
-        </w:rPr>
-        <w:t xml:space="preserve">geom_jitter()</w:t>
-      </w:r>
-      <w:r>
-        <w:t xml:space="preserve"> </w:t>
-      </w:r>
-      <w:r>
-        <w:t xml:space="preserve">second draws the points</w:t>
+        <w:t xml:space="preserve">once</w:t>
+      </w:r>
+      <w:r>
+        <w:t xml:space="preserve"> </w:t>
+      </w:r>
+      <w:r>
+        <w:t xml:space="preserve">as a variable so every layer can reuse it:</w:t>
+      </w:r>
+    </w:p>
+    <w:p>
+      <w:pPr>
+        <w:pStyle w:val="SourceCode"/>
+      </w:pPr>
+      <w:r>
+        <w:rPr>
+          <w:rStyle w:val="NormalTok"/>
+        </w:rPr>
+        <w:t xml:space="preserve">jitter_pos </w:t>
+      </w:r>
+      <w:r>
+        <w:rPr>
+          <w:rStyle w:val="OtherTok"/>
+        </w:rPr>
+        <w:t xml:space="preserve">&lt;-</w:t>
+      </w:r>
+      <w:r>
+        <w:rPr>
+          <w:rStyle w:val="NormalTok"/>
+        </w:rPr>
+        <w:t xml:space="preserve"> </w:t>
+      </w:r>
+      <w:r>
+        <w:rPr>
+          <w:rStyle w:val="FunctionTok"/>
+        </w:rPr>
+        <w:t xml:space="preserve">position_jitter</w:t>
+      </w:r>
+      <w:r>
+        <w:rPr>
+          <w:rStyle w:val="NormalTok"/>
+        </w:rPr>
+        <w:t xml:space="preserve">(</w:t>
+      </w:r>
+      <w:r>
+        <w:rPr>
+          <w:rStyle w:val="AttributeTok"/>
+        </w:rPr>
+        <w:t xml:space="preserve">width =</w:t>
+      </w:r>
+      <w:r>
+        <w:rPr>
+          <w:rStyle w:val="NormalTok"/>
+        </w:rPr>
+        <w:t xml:space="preserve"> </w:t>
+      </w:r>
+      <w:r>
+        <w:rPr>
+          <w:rStyle w:val="FloatTok"/>
+        </w:rPr>
+        <w:t xml:space="preserve">0.15</w:t>
+      </w:r>
+      <w:r>
+        <w:rPr>
+          <w:rStyle w:val="NormalTok"/>
+        </w:rPr>
+        <w:t xml:space="preserve">, </w:t>
+      </w:r>
+      <w:r>
+        <w:rPr>
+          <w:rStyle w:val="AttributeTok"/>
+        </w:rPr>
+        <w:t xml:space="preserve">seed =</w:t>
+      </w:r>
+      <w:r>
+        <w:rPr>
+          <w:rStyle w:val="NormalTok"/>
+        </w:rPr>
+        <w:t xml:space="preserve"> </w:t>
+      </w:r>
+      <w:r>
+        <w:rPr>
+          <w:rStyle w:val="DecValTok"/>
+        </w:rPr>
+        <w:t xml:space="preserve">42</w:t>
+      </w:r>
+      <w:r>
+        <w:rPr>
+          <w:rStyle w:val="NormalTok"/>
+        </w:rPr>
+        <w:t xml:space="preserve">)</w:t>
+      </w:r>
+      <w:r>
+        <w:br/>
+      </w:r>
+      <w:r>
+        <w:br/>
+      </w:r>
+      <w:r>
+        <w:rPr>
+          <w:rStyle w:val="FunctionTok"/>
+        </w:rPr>
+        <w:t xml:space="preserve">ggplot</w:t>
+      </w:r>
+      <w:r>
+        <w:rPr>
+          <w:rStyle w:val="NormalTok"/>
+        </w:rPr>
+        <w:t xml:space="preserve">(penguins, </w:t>
+      </w:r>
+      <w:r>
+        <w:rPr>
+          <w:rStyle w:val="FunctionTok"/>
+        </w:rPr>
+        <w:t xml:space="preserve">aes</w:t>
+      </w:r>
+      <w:r>
+        <w:rPr>
+          <w:rStyle w:val="NormalTok"/>
+        </w:rPr>
+        <w:t xml:space="preserve">(</w:t>
+      </w:r>
+      <w:r>
+        <w:rPr>
+          <w:rStyle w:val="AttributeTok"/>
+        </w:rPr>
+        <w:t xml:space="preserve">x =</w:t>
+      </w:r>
+      <w:r>
+        <w:rPr>
+          <w:rStyle w:val="NormalTok"/>
+        </w:rPr>
+        <w:t xml:space="preserve"> species, </w:t>
+      </w:r>
+      <w:r>
+        <w:rPr>
+          <w:rStyle w:val="AttributeTok"/>
+        </w:rPr>
+        <w:t xml:space="preserve">y =</w:t>
+      </w:r>
+      <w:r>
+        <w:rPr>
+          <w:rStyle w:val="NormalTok"/>
+        </w:rPr>
+        <w:t xml:space="preserve"> body_mass_g)) </w:t>
+      </w:r>
+      <w:r>
+        <w:rPr>
+          <w:rStyle w:val="SpecialCharTok"/>
+        </w:rPr>
+        <w:t xml:space="preserve">+</w:t>
+      </w:r>
+      <w:r>
+        <w:br/>
+      </w:r>
+      <w:r>
+        <w:rPr>
+          <w:rStyle w:val="NormalTok"/>
+        </w:rPr>
+        <w:t xml:space="preserve">  </w:t>
+      </w:r>
+      <w:r>
+        <w:rPr>
+          <w:rStyle w:val="FunctionTok"/>
+        </w:rPr>
+        <w:t xml:space="preserve">geom_boxplot</w:t>
+      </w:r>
+      <w:r>
+        <w:rPr>
+          <w:rStyle w:val="NormalTok"/>
+        </w:rPr>
+        <w:t xml:space="preserve">() </w:t>
+      </w:r>
+      <w:r>
+        <w:rPr>
+          <w:rStyle w:val="SpecialCharTok"/>
+        </w:rPr>
+        <w:t xml:space="preserve">+</w:t>
+      </w:r>
+      <w:r>
+        <w:br/>
+      </w:r>
+      <w:r>
+        <w:rPr>
+          <w:rStyle w:val="NormalTok"/>
+        </w:rPr>
+        <w:t xml:space="preserve">  </w:t>
+      </w:r>
+      <w:r>
+        <w:rPr>
+          <w:rStyle w:val="FunctionTok"/>
+        </w:rPr>
+        <w:t xml:space="preserve">geom_point</w:t>
+      </w:r>
+      <w:r>
+        <w:rPr>
+          <w:rStyle w:val="NormalTok"/>
+        </w:rPr>
+        <w:t xml:space="preserve">(</w:t>
+      </w:r>
+      <w:r>
+        <w:rPr>
+          <w:rStyle w:val="AttributeTok"/>
+        </w:rPr>
+        <w:t xml:space="preserve">position =</w:t>
+      </w:r>
+      <w:r>
+        <w:rPr>
+          <w:rStyle w:val="NormalTok"/>
+        </w:rPr>
+        <w:t xml:space="preserve"> jitter_pos, </w:t>
+      </w:r>
+      <w:r>
+        <w:rPr>
+          <w:rStyle w:val="AttributeTok"/>
+        </w:rPr>
+        <w:t xml:space="preserve">alpha =</w:t>
+      </w:r>
+      <w:r>
+        <w:rPr>
+          <w:rStyle w:val="NormalTok"/>
+        </w:rPr>
+        <w:t xml:space="preserve"> </w:t>
+      </w:r>
+      <w:r>
+        <w:rPr>
+          <w:rStyle w:val="FloatTok"/>
+        </w:rPr>
+        <w:t xml:space="preserve">0.4</w:t>
+      </w:r>
+      <w:r>
+        <w:rPr>
+          <w:rStyle w:val="NormalTok"/>
+        </w:rPr>
+        <w:t xml:space="preserve">, </w:t>
+      </w:r>
+      <w:r>
+        <w:rPr>
+          <w:rStyle w:val="AttributeTok"/>
+        </w:rPr>
+        <w:t xml:space="preserve">color =</w:t>
+      </w:r>
+      <w:r>
+        <w:rPr>
+          <w:rStyle w:val="NormalTok"/>
+        </w:rPr>
+        <w:t xml:space="preserve"> </w:t>
+      </w:r>
+      <w:r>
+        <w:rPr>
+          <w:rStyle w:val="StringTok"/>
+        </w:rPr>
+        <w:t xml:space="preserve">"darkblue"</w:t>
+      </w:r>
+      <w:r>
+        <w:rPr>
+          <w:rStyle w:val="NormalTok"/>
+        </w:rPr>
+        <w:t xml:space="preserve">)</w:t>
+      </w:r>
+    </w:p>
+    <w:p>
+      <w:pPr>
+        <w:pStyle w:val="BlockText"/>
+      </w:pPr>
+      <w:r>
+        <w:t xml:space="preserve">💡</w:t>
       </w:r>
       <w:r>
         <w:t xml:space="preserve"> </w:t>
@@ -2303,13 +2345,74 @@
           <w:b/>
           <w:bCs/>
         </w:rPr>
+        <w:t xml:space="preserve">Key idea:</w:t>
+      </w:r>
+      <w:r>
+        <w:t xml:space="preserve"> </w:t>
+      </w:r>
+      <w:r>
+        <w:t xml:space="preserve">Layer order matters —</w:t>
+      </w:r>
+      <w:r>
+        <w:t xml:space="preserve"> </w:t>
+      </w:r>
+      <w:r>
+        <w:rPr>
+          <w:rStyle w:val="VerbatimChar"/>
+        </w:rPr>
+        <w:t xml:space="preserve">geom_boxplot()</w:t>
+      </w:r>
+      <w:r>
+        <w:t xml:space="preserve"> </w:t>
+      </w:r>
+      <w:r>
+        <w:t xml:space="preserve">first, the points second, so the points sit</w:t>
+      </w:r>
+      <w:r>
+        <w:t xml:space="preserve"> </w:t>
+      </w:r>
+      <w:r>
+        <w:rPr>
+          <w:b/>
+          <w:bCs/>
+        </w:rPr>
         <w:t xml:space="preserve">on top of</w:t>
       </w:r>
       <w:r>
         <w:t xml:space="preserve"> </w:t>
       </w:r>
       <w:r>
-        <w:t xml:space="preserve">the boxes. Swap the order and the boxes cover the points.</w:t>
+        <w:t xml:space="preserve">the boxes.</w:t>
+      </w:r>
+      <w:r>
+        <w:t xml:space="preserve"> </w:t>
+      </w:r>
+      <w:r>
+        <w:rPr>
+          <w:rStyle w:val="VerbatimChar"/>
+        </w:rPr>
+        <w:t xml:space="preserve">position_jitter(width = 0.15)</w:t>
+      </w:r>
+      <w:r>
+        <w:t xml:space="preserve"> </w:t>
+      </w:r>
+      <w:r>
+        <w:t xml:space="preserve">spreads overlapping points sideways;</w:t>
+      </w:r>
+      <w:r>
+        <w:t xml:space="preserve"> </w:t>
+      </w:r>
+      <w:r>
+        <w:rPr>
+          <w:rStyle w:val="VerbatimChar"/>
+        </w:rPr>
+        <w:t xml:space="preserve">seed = 42</w:t>
+      </w:r>
+      <w:r>
+        <w:t xml:space="preserve"> </w:t>
+      </w:r>
+      <w:r>
+        <w:t xml:space="preserve">freezes that random spread so the figure is identical on every render.</w:t>
       </w:r>
     </w:p>
     <w:bookmarkEnd w:id="21"/>
@@ -2342,7 +2445,54 @@
         <w:t xml:space="preserve"> </w:t>
       </w:r>
       <w:r>
-        <w:t xml:space="preserve">to split each x-group:</w:t>
+        <w:t xml:space="preserve">to split each x-group. Now the horizontal offsets matter: dodge the boxes, and use</w:t>
+      </w:r>
+      <w:r>
+        <w:t xml:space="preserve"> </w:t>
+      </w:r>
+      <w:r>
+        <w:rPr>
+          <w:rStyle w:val="VerbatimChar"/>
+          <w:b/>
+          <w:bCs/>
+        </w:rPr>
+        <w:t xml:space="preserve">position_jitterdodge()</w:t>
+      </w:r>
+      <w:r>
+        <w:t xml:space="preserve"> </w:t>
+      </w:r>
+      <w:r>
+        <w:t xml:space="preserve">so the raw points land under their own box. Match</w:t>
+      </w:r>
+      <w:r>
+        <w:t xml:space="preserve"> </w:t>
+      </w:r>
+      <w:r>
+        <w:rPr>
+          <w:rStyle w:val="VerbatimChar"/>
+        </w:rPr>
+        <w:t xml:space="preserve">dodge.width</w:t>
+      </w:r>
+      <w:r>
+        <w:t xml:space="preserve"> </w:t>
+      </w:r>
+      <w:r>
+        <w:t xml:space="preserve">to the box</w:t>
+      </w:r>
+      <w:r>
+        <w:t xml:space="preserve"> </w:t>
+      </w:r>
+      <w:r>
+        <w:rPr>
+          <w:rStyle w:val="VerbatimChar"/>
+        </w:rPr>
+        <w:t xml:space="preserve">position_dodge()</w:t>
+      </w:r>
+      <w:r>
+        <w:t xml:space="preserve"> </w:t>
+      </w:r>
+      <w:r>
+        <w:t xml:space="preserve">width:</w:t>
       </w:r>
     </w:p>
     <w:p>
@@ -2351,8 +2501,149 @@
       </w:pPr>
       <w:r>
         <w:rPr>
+          <w:rStyle w:val="NormalTok"/>
+        </w:rPr>
+        <w:t xml:space="preserve">dodge_pos      </w:t>
+      </w:r>
+      <w:r>
+        <w:rPr>
+          <w:rStyle w:val="OtherTok"/>
+        </w:rPr>
+        <w:t xml:space="preserve">&lt;-</w:t>
+      </w:r>
+      <w:r>
+        <w:rPr>
+          <w:rStyle w:val="NormalTok"/>
+        </w:rPr>
+        <w:t xml:space="preserve"> </w:t>
+      </w:r>
+      <w:r>
+        <w:rPr>
           <w:rStyle w:val="FunctionTok"/>
         </w:rPr>
+        <w:t xml:space="preserve">position_dodge</w:t>
+      </w:r>
+      <w:r>
+        <w:rPr>
+          <w:rStyle w:val="NormalTok"/>
+        </w:rPr>
+        <w:t xml:space="preserve">(</w:t>
+      </w:r>
+      <w:r>
+        <w:rPr>
+          <w:rStyle w:val="AttributeTok"/>
+        </w:rPr>
+        <w:t xml:space="preserve">width =</w:t>
+      </w:r>
+      <w:r>
+        <w:rPr>
+          <w:rStyle w:val="NormalTok"/>
+        </w:rPr>
+        <w:t xml:space="preserve"> </w:t>
+      </w:r>
+      <w:r>
+        <w:rPr>
+          <w:rStyle w:val="FloatTok"/>
+        </w:rPr>
+        <w:t xml:space="preserve">0.75</w:t>
+      </w:r>
+      <w:r>
+        <w:rPr>
+          <w:rStyle w:val="NormalTok"/>
+        </w:rPr>
+        <w:t xml:space="preserve">)</w:t>
+      </w:r>
+      <w:r>
+        <w:br/>
+      </w:r>
+      <w:r>
+        <w:rPr>
+          <w:rStyle w:val="NormalTok"/>
+        </w:rPr>
+        <w:t xml:space="preserve">jitterdodge_pos </w:t>
+      </w:r>
+      <w:r>
+        <w:rPr>
+          <w:rStyle w:val="OtherTok"/>
+        </w:rPr>
+        <w:t xml:space="preserve">&lt;-</w:t>
+      </w:r>
+      <w:r>
+        <w:rPr>
+          <w:rStyle w:val="NormalTok"/>
+        </w:rPr>
+        <w:t xml:space="preserve"> </w:t>
+      </w:r>
+      <w:r>
+        <w:rPr>
+          <w:rStyle w:val="FunctionTok"/>
+        </w:rPr>
+        <w:t xml:space="preserve">position_jitterdodge</w:t>
+      </w:r>
+      <w:r>
+        <w:rPr>
+          <w:rStyle w:val="NormalTok"/>
+        </w:rPr>
+        <w:t xml:space="preserve">(</w:t>
+      </w:r>
+      <w:r>
+        <w:rPr>
+          <w:rStyle w:val="AttributeTok"/>
+        </w:rPr>
+        <w:t xml:space="preserve">jitter.width =</w:t>
+      </w:r>
+      <w:r>
+        <w:rPr>
+          <w:rStyle w:val="NormalTok"/>
+        </w:rPr>
+        <w:t xml:space="preserve"> </w:t>
+      </w:r>
+      <w:r>
+        <w:rPr>
+          <w:rStyle w:val="FloatTok"/>
+        </w:rPr>
+        <w:t xml:space="preserve">0.15</w:t>
+      </w:r>
+      <w:r>
+        <w:rPr>
+          <w:rStyle w:val="NormalTok"/>
+        </w:rPr>
+        <w:t xml:space="preserve">, </w:t>
+      </w:r>
+      <w:r>
+        <w:rPr>
+          <w:rStyle w:val="AttributeTok"/>
+        </w:rPr>
+        <w:t xml:space="preserve">dodge.width =</w:t>
+      </w:r>
+      <w:r>
+        <w:rPr>
+          <w:rStyle w:val="NormalTok"/>
+        </w:rPr>
+        <w:t xml:space="preserve"> </w:t>
+      </w:r>
+      <w:r>
+        <w:rPr>
+          <w:rStyle w:val="FloatTok"/>
+        </w:rPr>
+        <w:t xml:space="preserve">0.75</w:t>
+      </w:r>
+      <w:r>
+        <w:rPr>
+          <w:rStyle w:val="NormalTok"/>
+        </w:rPr>
+        <w:t xml:space="preserve">)</w:t>
+      </w:r>
+      <w:r>
+        <w:br/>
+      </w:r>
+      <w:r>
+        <w:br/>
+      </w:r>
+      <w:r>
+        <w:rPr>
+          <w:rStyle w:val="FunctionTok"/>
+        </w:rPr>
         <w:t xml:space="preserve">ggplot</w:t>
       </w:r>
       <w:r>
@@ -2458,7 +2749,224 @@
         <w:rPr>
           <w:rStyle w:val="NormalTok"/>
         </w:rPr>
+        <w:t xml:space="preserve">, </w:t>
+      </w:r>
+      <w:r>
+        <w:rPr>
+          <w:rStyle w:val="AttributeTok"/>
+        </w:rPr>
+        <w:t xml:space="preserve">outlier.shape =</w:t>
+      </w:r>
+      <w:r>
+        <w:rPr>
+          <w:rStyle w:val="NormalTok"/>
+        </w:rPr>
+        <w:t xml:space="preserve"> </w:t>
+      </w:r>
+      <w:r>
+        <w:rPr>
+          <w:rStyle w:val="ConstantTok"/>
+        </w:rPr>
+        <w:t xml:space="preserve">NA</w:t>
+      </w:r>
+      <w:r>
+        <w:rPr>
+          <w:rStyle w:val="NormalTok"/>
+        </w:rPr>
+        <w:t xml:space="preserve">, </w:t>
+      </w:r>
+      <w:r>
+        <w:rPr>
+          <w:rStyle w:val="AttributeTok"/>
+        </w:rPr>
+        <w:t xml:space="preserve">position =</w:t>
+      </w:r>
+      <w:r>
+        <w:rPr>
+          <w:rStyle w:val="NormalTok"/>
+        </w:rPr>
+        <w:t xml:space="preserve"> dodge_pos) </w:t>
+      </w:r>
+      <w:r>
+        <w:rPr>
+          <w:rStyle w:val="SpecialCharTok"/>
+        </w:rPr>
+        <w:t xml:space="preserve">+</w:t>
+      </w:r>
+      <w:r>
+        <w:br/>
+      </w:r>
+      <w:r>
+        <w:rPr>
+          <w:rStyle w:val="NormalTok"/>
+        </w:rPr>
+        <w:t xml:space="preserve">  </w:t>
+      </w:r>
+      <w:r>
+        <w:rPr>
+          <w:rStyle w:val="FunctionTok"/>
+        </w:rPr>
+        <w:t xml:space="preserve">geom_point</w:t>
+      </w:r>
+      <w:r>
+        <w:rPr>
+          <w:rStyle w:val="NormalTok"/>
+        </w:rPr>
+        <w:t xml:space="preserve">(</w:t>
+      </w:r>
+      <w:r>
+        <w:rPr>
+          <w:rStyle w:val="AttributeTok"/>
+        </w:rPr>
+        <w:t xml:space="preserve">position =</w:t>
+      </w:r>
+      <w:r>
+        <w:rPr>
+          <w:rStyle w:val="NormalTok"/>
+        </w:rPr>
+        <w:t xml:space="preserve"> jitterdodge_pos, </w:t>
+      </w:r>
+      <w:r>
+        <w:rPr>
+          <w:rStyle w:val="AttributeTok"/>
+        </w:rPr>
+        <w:t xml:space="preserve">alpha =</w:t>
+      </w:r>
+      <w:r>
+        <w:rPr>
+          <w:rStyle w:val="NormalTok"/>
+        </w:rPr>
+        <w:t xml:space="preserve"> </w:t>
+      </w:r>
+      <w:r>
+        <w:rPr>
+          <w:rStyle w:val="FloatTok"/>
+        </w:rPr>
+        <w:t xml:space="preserve">0.3</w:t>
+      </w:r>
+      <w:r>
+        <w:rPr>
+          <w:rStyle w:val="NormalTok"/>
+        </w:rPr>
+        <w:t xml:space="preserve">, </w:t>
+      </w:r>
+      <w:r>
+        <w:rPr>
+          <w:rStyle w:val="AttributeTok"/>
+        </w:rPr>
+        <w:t xml:space="preserve">size =</w:t>
+      </w:r>
+      <w:r>
+        <w:rPr>
+          <w:rStyle w:val="NormalTok"/>
+        </w:rPr>
+        <w:t xml:space="preserve"> </w:t>
+      </w:r>
+      <w:r>
+        <w:rPr>
+          <w:rStyle w:val="DecValTok"/>
+        </w:rPr>
+        <w:t xml:space="preserve">1</w:t>
+      </w:r>
+      <w:r>
+        <w:rPr>
+          <w:rStyle w:val="NormalTok"/>
+        </w:rPr>
         <w:t xml:space="preserve">)</w:t>
+      </w:r>
+    </w:p>
+    <w:p>
+      <w:pPr>
+        <w:pStyle w:val="BlockText"/>
+      </w:pPr>
+      <w:r>
+        <w:t xml:space="preserve">💡</w:t>
+      </w:r>
+      <w:r>
+        <w:t xml:space="preserve"> </w:t>
+      </w:r>
+      <w:r>
+        <w:rPr>
+          <w:b/>
+          <w:bCs/>
+        </w:rPr>
+        <w:t xml:space="preserve">Key idea:</w:t>
+      </w:r>
+      <w:r>
+        <w:t xml:space="preserve"> </w:t>
+      </w:r>
+      <w:r>
+        <w:rPr>
+          <w:rStyle w:val="VerbatimChar"/>
+        </w:rPr>
+        <w:t xml:space="preserve">position_dodge()</w:t>
+      </w:r>
+      <w:r>
+        <w:t xml:space="preserve"> </w:t>
+      </w:r>
+      <w:r>
+        <w:t xml:space="preserve">shifts</w:t>
+      </w:r>
+      <w:r>
+        <w:t xml:space="preserve"> </w:t>
+      </w:r>
+      <w:r>
+        <w:rPr>
+          <w:i/>
+          <w:iCs/>
+        </w:rPr>
+        <w:t xml:space="preserve">whole groups</w:t>
+      </w:r>
+      <w:r>
+        <w:t xml:space="preserve"> </w:t>
+      </w:r>
+      <w:r>
+        <w:t xml:space="preserve">apart but does not scatter points within a group;</w:t>
+      </w:r>
+      <w:r>
+        <w:t xml:space="preserve"> </w:t>
+      </w:r>
+      <w:r>
+        <w:rPr>
+          <w:rStyle w:val="VerbatimChar"/>
+        </w:rPr>
+        <w:t xml:space="preserve">position_jitterdodge()</w:t>
+      </w:r>
+      <w:r>
+        <w:t xml:space="preserve"> </w:t>
+      </w:r>
+      <w:r>
+        <w:t xml:space="preserve">does both.</w:t>
+      </w:r>
+      <w:r>
+        <w:t xml:space="preserve"> </w:t>
+      </w:r>
+      <w:r>
+        <w:rPr>
+          <w:rStyle w:val="VerbatimChar"/>
+        </w:rPr>
+        <w:t xml:space="preserve">position_dodge()</w:t>
+      </w:r>
+      <w:r>
+        <w:t xml:space="preserve"> </w:t>
+      </w:r>
+      <w:r>
+        <w:t xml:space="preserve">alone is the right choice for connected summaries (mean points, error bars, and</w:t>
+      </w:r>
+      <w:r>
+        <w:t xml:space="preserve"> </w:t>
+      </w:r>
+      <w:r>
+        <w:rPr>
+          <w:rStyle w:val="VerbatimChar"/>
+        </w:rPr>
+        <w:t xml:space="preserve">geom_line()</w:t>
+      </w:r>
+      <w:r>
+        <w:t xml:space="preserve"> </w:t>
+      </w:r>
+      <w:r>
+        <w:t xml:space="preserve">between them) — see the advanced plotting reference.</w:t>
       </w:r>
     </w:p>
     <w:p>
@@ -7246,7 +7754,7 @@
               <w:rPr>
                 <w:rStyle w:val="VerbatimChar"/>
               </w:rPr>
-              <w:t xml:space="preserve">geom_jitter(width = 0.15, alpha = 0.5)</w:t>
+              <w:t xml:space="preserve">geom_point(position = position_jitter(width = 0.15, seed = 42), alpha = 0.5)</w:t>
             </w:r>
           </w:p>
         </w:tc>

</xml_diff>

<commit_message>
goign to fix the ggplot 2
</commit_message>
<xml_diff>
--- a/docs/common_code/03_ggplot/ggplot.docx
+++ b/docs/common_code/03_ggplot/ggplot.docx
@@ -31,7 +31,7 @@
         <w:pStyle w:val="Date"/>
       </w:pPr>
       <w:r>
-        <w:t xml:space="preserve">2026-09-10</w:t>
+        <w:t xml:space="preserve">2026-09-14</w:t>
       </w:r>
     </w:p>
     <w:bookmarkStart w:id="11" w:name="introduction-to-ggplot2"/>
@@ -2060,7 +2060,194 @@
         <w:pStyle w:val="FirstParagraph"/>
       </w:pPr>
       <w:r>
-        <w:t xml:space="preserve">A boxplot alone hides sample size. Adding jittered points shows both the distribution shape and how many observations went into each box. Define the point position</w:t>
+        <w:t xml:space="preserve">A boxplot alone hides sample size. Adding jittered points shows both the distribution shape and how many observations went into each box:</w:t>
+      </w:r>
+    </w:p>
+    <w:p>
+      <w:pPr>
+        <w:pStyle w:val="SourceCode"/>
+      </w:pPr>
+      <w:r>
+        <w:rPr>
+          <w:rStyle w:val="FunctionTok"/>
+        </w:rPr>
+        <w:t xml:space="preserve">ggplot</w:t>
+      </w:r>
+      <w:r>
+        <w:rPr>
+          <w:rStyle w:val="NormalTok"/>
+        </w:rPr>
+        <w:t xml:space="preserve">(penguins, </w:t>
+      </w:r>
+      <w:r>
+        <w:rPr>
+          <w:rStyle w:val="FunctionTok"/>
+        </w:rPr>
+        <w:t xml:space="preserve">aes</w:t>
+      </w:r>
+      <w:r>
+        <w:rPr>
+          <w:rStyle w:val="NormalTok"/>
+        </w:rPr>
+        <w:t xml:space="preserve">(</w:t>
+      </w:r>
+      <w:r>
+        <w:rPr>
+          <w:rStyle w:val="AttributeTok"/>
+        </w:rPr>
+        <w:t xml:space="preserve">x =</w:t>
+      </w:r>
+      <w:r>
+        <w:rPr>
+          <w:rStyle w:val="NormalTok"/>
+        </w:rPr>
+        <w:t xml:space="preserve"> species, </w:t>
+      </w:r>
+      <w:r>
+        <w:rPr>
+          <w:rStyle w:val="AttributeTok"/>
+        </w:rPr>
+        <w:t xml:space="preserve">y =</w:t>
+      </w:r>
+      <w:r>
+        <w:rPr>
+          <w:rStyle w:val="NormalTok"/>
+        </w:rPr>
+        <w:t xml:space="preserve"> body_mass_g)) </w:t>
+      </w:r>
+      <w:r>
+        <w:rPr>
+          <w:rStyle w:val="SpecialCharTok"/>
+        </w:rPr>
+        <w:t xml:space="preserve">+</w:t>
+      </w:r>
+      <w:r>
+        <w:br/>
+      </w:r>
+      <w:r>
+        <w:rPr>
+          <w:rStyle w:val="NormalTok"/>
+        </w:rPr>
+        <w:t xml:space="preserve">  </w:t>
+      </w:r>
+      <w:r>
+        <w:rPr>
+          <w:rStyle w:val="FunctionTok"/>
+        </w:rPr>
+        <w:t xml:space="preserve">geom_boxplot</w:t>
+      </w:r>
+      <w:r>
+        <w:rPr>
+          <w:rStyle w:val="NormalTok"/>
+        </w:rPr>
+        <w:t xml:space="preserve">() </w:t>
+      </w:r>
+      <w:r>
+        <w:rPr>
+          <w:rStyle w:val="SpecialCharTok"/>
+        </w:rPr>
+        <w:t xml:space="preserve">+</w:t>
+      </w:r>
+      <w:r>
+        <w:br/>
+      </w:r>
+      <w:r>
+        <w:rPr>
+          <w:rStyle w:val="NormalTok"/>
+        </w:rPr>
+        <w:t xml:space="preserve">  </w:t>
+      </w:r>
+      <w:r>
+        <w:rPr>
+          <w:rStyle w:val="FunctionTok"/>
+        </w:rPr>
+        <w:t xml:space="preserve">geom_jitter</w:t>
+      </w:r>
+      <w:r>
+        <w:rPr>
+          <w:rStyle w:val="NormalTok"/>
+        </w:rPr>
+        <w:t xml:space="preserve">(</w:t>
+      </w:r>
+      <w:r>
+        <w:rPr>
+          <w:rStyle w:val="AttributeTok"/>
+        </w:rPr>
+        <w:t xml:space="preserve">width =</w:t>
+      </w:r>
+      <w:r>
+        <w:rPr>
+          <w:rStyle w:val="NormalTok"/>
+        </w:rPr>
+        <w:t xml:space="preserve"> </w:t>
+      </w:r>
+      <w:r>
+        <w:rPr>
+          <w:rStyle w:val="FloatTok"/>
+        </w:rPr>
+        <w:t xml:space="preserve">0.15</w:t>
+      </w:r>
+      <w:r>
+        <w:rPr>
+          <w:rStyle w:val="NormalTok"/>
+        </w:rPr>
+        <w:t xml:space="preserve">, </w:t>
+      </w:r>
+      <w:r>
+        <w:rPr>
+          <w:rStyle w:val="AttributeTok"/>
+        </w:rPr>
+        <w:t xml:space="preserve">alpha =</w:t>
+      </w:r>
+      <w:r>
+        <w:rPr>
+          <w:rStyle w:val="NormalTok"/>
+        </w:rPr>
+        <w:t xml:space="preserve"> </w:t>
+      </w:r>
+      <w:r>
+        <w:rPr>
+          <w:rStyle w:val="FloatTok"/>
+        </w:rPr>
+        <w:t xml:space="preserve">0.4</w:t>
+      </w:r>
+      <w:r>
+        <w:rPr>
+          <w:rStyle w:val="NormalTok"/>
+        </w:rPr>
+        <w:t xml:space="preserve">, </w:t>
+      </w:r>
+      <w:r>
+        <w:rPr>
+          <w:rStyle w:val="AttributeTok"/>
+        </w:rPr>
+        <w:t xml:space="preserve">color =</w:t>
+      </w:r>
+      <w:r>
+        <w:rPr>
+          <w:rStyle w:val="NormalTok"/>
+        </w:rPr>
+        <w:t xml:space="preserve"> </w:t>
+      </w:r>
+      <w:r>
+        <w:rPr>
+          <w:rStyle w:val="StringTok"/>
+        </w:rPr>
+        <w:t xml:space="preserve">"darkblue"</w:t>
+      </w:r>
+      <w:r>
+        <w:rPr>
+          <w:rStyle w:val="NormalTok"/>
+        </w:rPr>
+        <w:t xml:space="preserve">)</w:t>
+      </w:r>
+    </w:p>
+    <w:p>
+      <w:pPr>
+        <w:pStyle w:val="BlockText"/>
+      </w:pPr>
+      <w:r>
+        <w:t xml:space="preserve">💡</w:t>
       </w:r>
       <w:r>
         <w:t xml:space="preserve"> </w:t>
@@ -2070,272 +2257,43 @@
           <w:b/>
           <w:bCs/>
         </w:rPr>
-        <w:t xml:space="preserve">once</w:t>
-      </w:r>
-      <w:r>
-        <w:t xml:space="preserve"> </w:t>
-      </w:r>
-      <w:r>
-        <w:t xml:space="preserve">as a variable so every layer can reuse it:</w:t>
-      </w:r>
-    </w:p>
-    <w:p>
-      <w:pPr>
-        <w:pStyle w:val="SourceCode"/>
-      </w:pPr>
-      <w:r>
-        <w:rPr>
-          <w:rStyle w:val="NormalTok"/>
-        </w:rPr>
-        <w:t xml:space="preserve">jitter_pos </w:t>
-      </w:r>
-      <w:r>
-        <w:rPr>
-          <w:rStyle w:val="OtherTok"/>
-        </w:rPr>
-        <w:t xml:space="preserve">&lt;-</w:t>
-      </w:r>
-      <w:r>
-        <w:rPr>
-          <w:rStyle w:val="NormalTok"/>
-        </w:rPr>
-        <w:t xml:space="preserve"> </w:t>
-      </w:r>
-      <w:r>
-        <w:rPr>
-          <w:rStyle w:val="FunctionTok"/>
-        </w:rPr>
-        <w:t xml:space="preserve">position_jitter</w:t>
-      </w:r>
-      <w:r>
-        <w:rPr>
-          <w:rStyle w:val="NormalTok"/>
-        </w:rPr>
-        <w:t xml:space="preserve">(</w:t>
-      </w:r>
-      <w:r>
-        <w:rPr>
-          <w:rStyle w:val="AttributeTok"/>
-        </w:rPr>
-        <w:t xml:space="preserve">width =</w:t>
-      </w:r>
-      <w:r>
-        <w:rPr>
-          <w:rStyle w:val="NormalTok"/>
-        </w:rPr>
-        <w:t xml:space="preserve"> </w:t>
-      </w:r>
-      <w:r>
-        <w:rPr>
-          <w:rStyle w:val="FloatTok"/>
-        </w:rPr>
-        <w:t xml:space="preserve">0.15</w:t>
-      </w:r>
-      <w:r>
-        <w:rPr>
-          <w:rStyle w:val="NormalTok"/>
-        </w:rPr>
-        <w:t xml:space="preserve">, </w:t>
-      </w:r>
-      <w:r>
-        <w:rPr>
-          <w:rStyle w:val="AttributeTok"/>
-        </w:rPr>
-        <w:t xml:space="preserve">seed =</w:t>
-      </w:r>
-      <w:r>
-        <w:rPr>
-          <w:rStyle w:val="NormalTok"/>
-        </w:rPr>
-        <w:t xml:space="preserve"> </w:t>
-      </w:r>
-      <w:r>
-        <w:rPr>
-          <w:rStyle w:val="DecValTok"/>
-        </w:rPr>
-        <w:t xml:space="preserve">42</w:t>
-      </w:r>
-      <w:r>
-        <w:rPr>
-          <w:rStyle w:val="NormalTok"/>
-        </w:rPr>
-        <w:t xml:space="preserve">)</w:t>
-      </w:r>
-      <w:r>
-        <w:br/>
-      </w:r>
-      <w:r>
-        <w:br/>
-      </w:r>
-      <w:r>
-        <w:rPr>
-          <w:rStyle w:val="FunctionTok"/>
-        </w:rPr>
-        <w:t xml:space="preserve">ggplot</w:t>
-      </w:r>
-      <w:r>
-        <w:rPr>
-          <w:rStyle w:val="NormalTok"/>
-        </w:rPr>
-        <w:t xml:space="preserve">(penguins, </w:t>
-      </w:r>
-      <w:r>
-        <w:rPr>
-          <w:rStyle w:val="FunctionTok"/>
-        </w:rPr>
-        <w:t xml:space="preserve">aes</w:t>
-      </w:r>
-      <w:r>
-        <w:rPr>
-          <w:rStyle w:val="NormalTok"/>
-        </w:rPr>
-        <w:t xml:space="preserve">(</w:t>
-      </w:r>
-      <w:r>
-        <w:rPr>
-          <w:rStyle w:val="AttributeTok"/>
-        </w:rPr>
-        <w:t xml:space="preserve">x =</w:t>
-      </w:r>
-      <w:r>
-        <w:rPr>
-          <w:rStyle w:val="NormalTok"/>
-        </w:rPr>
-        <w:t xml:space="preserve"> species, </w:t>
-      </w:r>
-      <w:r>
-        <w:rPr>
-          <w:rStyle w:val="AttributeTok"/>
-        </w:rPr>
-        <w:t xml:space="preserve">y =</w:t>
-      </w:r>
-      <w:r>
-        <w:rPr>
-          <w:rStyle w:val="NormalTok"/>
-        </w:rPr>
-        <w:t xml:space="preserve"> body_mass_g)) </w:t>
-      </w:r>
-      <w:r>
-        <w:rPr>
-          <w:rStyle w:val="SpecialCharTok"/>
-        </w:rPr>
-        <w:t xml:space="preserve">+</w:t>
-      </w:r>
-      <w:r>
-        <w:br/>
-      </w:r>
-      <w:r>
-        <w:rPr>
-          <w:rStyle w:val="NormalTok"/>
-        </w:rPr>
-        <w:t xml:space="preserve">  </w:t>
-      </w:r>
-      <w:r>
-        <w:rPr>
-          <w:rStyle w:val="FunctionTok"/>
-        </w:rPr>
-        <w:t xml:space="preserve">geom_boxplot</w:t>
-      </w:r>
-      <w:r>
-        <w:rPr>
-          <w:rStyle w:val="NormalTok"/>
-        </w:rPr>
-        <w:t xml:space="preserve">() </w:t>
-      </w:r>
-      <w:r>
-        <w:rPr>
-          <w:rStyle w:val="SpecialCharTok"/>
-        </w:rPr>
-        <w:t xml:space="preserve">+</w:t>
-      </w:r>
-      <w:r>
-        <w:br/>
-      </w:r>
-      <w:r>
-        <w:rPr>
-          <w:rStyle w:val="NormalTok"/>
-        </w:rPr>
-        <w:t xml:space="preserve">  </w:t>
-      </w:r>
-      <w:r>
-        <w:rPr>
-          <w:rStyle w:val="FunctionTok"/>
-        </w:rPr>
-        <w:t xml:space="preserve">geom_point</w:t>
-      </w:r>
-      <w:r>
-        <w:rPr>
-          <w:rStyle w:val="NormalTok"/>
-        </w:rPr>
-        <w:t xml:space="preserve">(</w:t>
-      </w:r>
-      <w:r>
-        <w:rPr>
-          <w:rStyle w:val="AttributeTok"/>
-        </w:rPr>
-        <w:t xml:space="preserve">position =</w:t>
-      </w:r>
-      <w:r>
-        <w:rPr>
-          <w:rStyle w:val="NormalTok"/>
-        </w:rPr>
-        <w:t xml:space="preserve"> jitter_pos, </w:t>
-      </w:r>
-      <w:r>
-        <w:rPr>
-          <w:rStyle w:val="AttributeTok"/>
-        </w:rPr>
-        <w:t xml:space="preserve">alpha =</w:t>
-      </w:r>
-      <w:r>
-        <w:rPr>
-          <w:rStyle w:val="NormalTok"/>
-        </w:rPr>
-        <w:t xml:space="preserve"> </w:t>
-      </w:r>
-      <w:r>
-        <w:rPr>
-          <w:rStyle w:val="FloatTok"/>
-        </w:rPr>
-        <w:t xml:space="preserve">0.4</w:t>
-      </w:r>
-      <w:r>
-        <w:rPr>
-          <w:rStyle w:val="NormalTok"/>
-        </w:rPr>
-        <w:t xml:space="preserve">, </w:t>
-      </w:r>
-      <w:r>
-        <w:rPr>
-          <w:rStyle w:val="AttributeTok"/>
-        </w:rPr>
-        <w:t xml:space="preserve">color =</w:t>
-      </w:r>
-      <w:r>
-        <w:rPr>
-          <w:rStyle w:val="NormalTok"/>
-        </w:rPr>
-        <w:t xml:space="preserve"> </w:t>
-      </w:r>
-      <w:r>
-        <w:rPr>
-          <w:rStyle w:val="StringTok"/>
-        </w:rPr>
-        <w:t xml:space="preserve">"darkblue"</w:t>
-      </w:r>
-      <w:r>
-        <w:rPr>
-          <w:rStyle w:val="NormalTok"/>
-        </w:rPr>
-        <w:t xml:space="preserve">)</w:t>
-      </w:r>
-    </w:p>
-    <w:p>
-      <w:pPr>
-        <w:pStyle w:val="BlockText"/>
-      </w:pPr>
-      <w:r>
-        <w:t xml:space="preserve">💡</w:t>
+        <w:t xml:space="preserve">Key idea:</w:t>
+      </w:r>
+      <w:r>
+        <w:t xml:space="preserve"> </w:t>
+      </w:r>
+      <w:r>
+        <w:t xml:space="preserve">Layer order matters.</w:t>
+      </w:r>
+      <w:r>
+        <w:t xml:space="preserve"> </w:t>
+      </w:r>
+      <w:r>
+        <w:rPr>
+          <w:rStyle w:val="VerbatimChar"/>
+        </w:rPr>
+        <w:t xml:space="preserve">geom_boxplot()</w:t>
+      </w:r>
+      <w:r>
+        <w:t xml:space="preserve"> </w:t>
+      </w:r>
+      <w:r>
+        <w:t xml:space="preserve">first and</w:t>
+      </w:r>
+      <w:r>
+        <w:t xml:space="preserve"> </w:t>
+      </w:r>
+      <w:r>
+        <w:rPr>
+          <w:rStyle w:val="VerbatimChar"/>
+        </w:rPr>
+        <w:t xml:space="preserve">geom_jitter()</w:t>
+      </w:r>
+      <w:r>
+        <w:t xml:space="preserve"> </w:t>
+      </w:r>
+      <w:r>
+        <w:t xml:space="preserve">second draws the points</w:t>
       </w:r>
       <w:r>
         <w:t xml:space="preserve"> </w:t>
@@ -2345,13 +2303,13 @@
           <w:b/>
           <w:bCs/>
         </w:rPr>
-        <w:t xml:space="preserve">Key idea:</w:t>
-      </w:r>
-      <w:r>
-        <w:t xml:space="preserve"> </w:t>
-      </w:r>
-      <w:r>
-        <w:t xml:space="preserve">Layer order matters —</w:t>
+        <w:t xml:space="preserve">on top of</w:t>
+      </w:r>
+      <w:r>
+        <w:t xml:space="preserve"> </w:t>
+      </w:r>
+      <w:r>
+        <w:t xml:space="preserve">the boxes.</w:t>
       </w:r>
       <w:r>
         <w:t xml:space="preserve"> </w:t>
@@ -2360,29 +2318,13 @@
         <w:rPr>
           <w:rStyle w:val="VerbatimChar"/>
         </w:rPr>
-        <w:t xml:space="preserve">geom_boxplot()</w:t>
-      </w:r>
-      <w:r>
-        <w:t xml:space="preserve"> </w:t>
-      </w:r>
-      <w:r>
-        <w:t xml:space="preserve">first, the points second, so the points sit</w:t>
-      </w:r>
-      <w:r>
-        <w:t xml:space="preserve"> </w:t>
-      </w:r>
-      <w:r>
-        <w:rPr>
-          <w:b/>
-          <w:bCs/>
-        </w:rPr>
-        <w:t xml:space="preserve">on top of</w:t>
-      </w:r>
-      <w:r>
-        <w:t xml:space="preserve"> </w:t>
-      </w:r>
-      <w:r>
-        <w:t xml:space="preserve">the boxes.</w:t>
+        <w:t xml:space="preserve">geom_jitter()</w:t>
+      </w:r>
+      <w:r>
+        <w:t xml:space="preserve"> </w:t>
+      </w:r>
+      <w:r>
+        <w:t xml:space="preserve">is</w:t>
       </w:r>
       <w:r>
         <w:t xml:space="preserve"> </w:t>
@@ -2391,28 +2333,22 @@
         <w:rPr>
           <w:rStyle w:val="VerbatimChar"/>
         </w:rPr>
-        <w:t xml:space="preserve">position_jitter(width = 0.15)</w:t>
-      </w:r>
-      <w:r>
-        <w:t xml:space="preserve"> </w:t>
-      </w:r>
-      <w:r>
-        <w:t xml:space="preserve">spreads overlapping points sideways;</w:t>
-      </w:r>
-      <w:r>
-        <w:t xml:space="preserve"> </w:t>
+        <w:t xml:space="preserve">geom_point()</w:t>
+      </w:r>
+      <w:r>
+        <w:t xml:space="preserve"> </w:t>
+      </w:r>
+      <w:r>
+        <w:t xml:space="preserve">with a small sideways nudge (</w:t>
       </w:r>
       <w:r>
         <w:rPr>
           <w:rStyle w:val="VerbatimChar"/>
         </w:rPr>
-        <w:t xml:space="preserve">seed = 42</w:t>
-      </w:r>
-      <w:r>
-        <w:t xml:space="preserve"> </w:t>
-      </w:r>
-      <w:r>
-        <w:t xml:space="preserve">freezes that random spread so the figure is identical on every render.</w:t>
+        <w:t xml:space="preserve">width = 0.15</w:t>
+      </w:r>
+      <w:r>
+        <w:t xml:space="preserve">) so overlapping points don’t hide each other.</w:t>
       </w:r>
     </w:p>
     <w:bookmarkEnd w:id="21"/>
@@ -7754,7 +7690,34 @@
               <w:rPr>
                 <w:rStyle w:val="VerbatimChar"/>
               </w:rPr>
-              <w:t xml:space="preserve">geom_point(position = position_jitter(width = 0.15, seed = 42), alpha = 0.5)</w:t>
+              <w:t xml:space="preserve">geom_jitter(width = 0.15, alpha = 0.5)</w:t>
+            </w:r>
+          </w:p>
+        </w:tc>
+      </w:tr>
+      <w:tr>
+        <w:tc>
+          <w:tcPr/>
+          <w:p>
+            <w:pPr>
+              <w:pStyle w:val="Compact"/>
+            </w:pPr>
+            <w:r>
+              <w:t xml:space="preserve">Raw points, 2 groups</w:t>
+            </w:r>
+          </w:p>
+        </w:tc>
+        <w:tc>
+          <w:tcPr/>
+          <w:p>
+            <w:pPr>
+              <w:pStyle w:val="Compact"/>
+            </w:pPr>
+            <w:r>
+              <w:rPr>
+                <w:rStyle w:val="VerbatimChar"/>
+              </w:rPr>
+              <w:t xml:space="preserve">geom_point(position = position_jitterdodge(jitter.width = 0.15, dodge.width = 0.75))</w:t>
             </w:r>
           </w:p>
         </w:tc>

</xml_diff>